<commit_message>
Icon and bowlers view fixes
</commit_message>
<xml_diff>
--- a/BrackWorks ToDo.docx
+++ b/BrackWorks ToDo.docx
@@ -11,219 +11,8 @@
         </w:numPr>
       </w:pPr>
       <w:r>
-        <w:t>Set up Google Workspace for BracketWorks.com</w:t>
+        <w:t xml:space="preserve">Add a pop up on the brackets page that if the entries changed the user should rerun brackets. This pop should also occur on the scores page if the user tries to create payouts if there is a mismatch between the entries and brackets. </w:t>
       </w:r>
-    </w:p>
-    <w:p>
-      <w:pPr>
-        <w:pStyle w:val="ListParagraph"/>
-        <w:numPr>
-          <w:ilvl w:val="1"/>
-          <w:numId w:val="16"/>
-        </w:numPr>
-      </w:pPr>
-      <w:hyperlink r:id="rId5" w:history="1">
-        <w:r>
-          <w:rPr>
-            <w:rStyle w:val="Hyperlink"/>
-          </w:rPr>
-          <w:t>mazzagotte@bracketworks.app</w:t>
-        </w:r>
-      </w:hyperlink>
-      <w:r>
-        <w:t xml:space="preserve"> [</w:t>
-      </w:r>
-      <w:r>
-        <w:t>Main owner/admin email</w:t>
-      </w:r>
-      <w:r>
-        <w:t>]</w:t>
-      </w:r>
-    </w:p>
-    <w:p>
-      <w:pPr>
-        <w:pStyle w:val="ListParagraph"/>
-        <w:numPr>
-          <w:ilvl w:val="1"/>
-          <w:numId w:val="16"/>
-        </w:numPr>
-      </w:pPr>
-      <w:proofErr w:type="spellStart"/>
-      <w:r>
-        <w:t>support@bracketworks.</w:t>
-      </w:r>
-      <w:r>
-        <w:t>aa</w:t>
-      </w:r>
-      <w:r>
-        <w:t>pp</w:t>
-      </w:r>
-      <w:proofErr w:type="spellEnd"/>
-      <w:r>
-        <w:t xml:space="preserve"> [</w:t>
-      </w:r>
-      <w:r>
-        <w:t>Customer support inbox</w:t>
-      </w:r>
-      <w:r>
-        <w:t>]</w:t>
-      </w:r>
-    </w:p>
-    <w:p>
-      <w:pPr>
-        <w:pStyle w:val="ListParagraph"/>
-        <w:numPr>
-          <w:ilvl w:val="1"/>
-          <w:numId w:val="16"/>
-        </w:numPr>
-      </w:pPr>
-      <w:hyperlink r:id="rId6" w:history="1">
-        <w:r>
-          <w:rPr>
-            <w:rStyle w:val="Hyperlink"/>
-          </w:rPr>
-          <w:t>no-reply@bracketworks.app</w:t>
-        </w:r>
-      </w:hyperlink>
-      <w:r>
-        <w:t xml:space="preserve"> [</w:t>
-      </w:r>
-      <w:r>
-        <w:t>Password resets, verification codes, account notices</w:t>
-      </w:r>
-      <w:r>
-        <w:t>]</w:t>
-      </w:r>
-    </w:p>
-    <w:p>
-      <w:pPr>
-        <w:pStyle w:val="ListParagraph"/>
-        <w:numPr>
-          <w:ilvl w:val="1"/>
-          <w:numId w:val="16"/>
-        </w:numPr>
-      </w:pPr>
-      <w:hyperlink r:id="rId7" w:history="1">
-        <w:r>
-          <w:rPr>
-            <w:rStyle w:val="Hyperlink"/>
-          </w:rPr>
-          <w:t>security@bracketworks.com</w:t>
-        </w:r>
-      </w:hyperlink>
-      <w:r>
-        <w:t xml:space="preserve"> [</w:t>
-      </w:r>
-      <w:r>
-        <w:t>Optional future security/contact address</w:t>
-      </w:r>
-      <w:r>
-        <w:t>]</w:t>
-      </w:r>
-    </w:p>
-    <w:p>
-      <w:pPr>
-        <w:ind w:left="1080"/>
-      </w:pPr>
-      <w:r>
-        <w:t>Mazzagotte@BrackWorks.app</w:t>
-      </w:r>
-    </w:p>
-    <w:p>
-      <w:pPr>
-        <w:ind w:left="1080"/>
-      </w:pPr>
-      <w:r>
-        <w:t>BennyBaseball_2026</w:t>
-      </w:r>
-    </w:p>
-    <w:p>
-      <w:pPr>
-        <w:pStyle w:val="ListParagraph"/>
-        <w:numPr>
-          <w:ilvl w:val="0"/>
-          <w:numId w:val="16"/>
-        </w:numPr>
-      </w:pPr>
-      <w:r>
-        <w:t xml:space="preserve">Set up email through </w:t>
-      </w:r>
-      <w:hyperlink r:id="rId8" w:history="1">
-        <w:r>
-          <w:rPr>
-            <w:rStyle w:val="Hyperlink"/>
-          </w:rPr>
-          <w:t>https://resend.com/</w:t>
-        </w:r>
-      </w:hyperlink>
-    </w:p>
-    <w:p>
-      <w:pPr>
-        <w:pStyle w:val="ListParagraph"/>
-        <w:numPr>
-          <w:ilvl w:val="1"/>
-          <w:numId w:val="16"/>
-        </w:numPr>
-      </w:pPr>
-      <w:proofErr w:type="spellStart"/>
-      <w:r>
-        <w:t>logo_url</w:t>
-      </w:r>
-      <w:proofErr w:type="spellEnd"/>
-      <w:r>
-        <w:t>: "https://bracketworks.app/images/logo.png",</w:t>
-      </w:r>
-      <w:r>
-        <w:br/>
-      </w:r>
-      <w:proofErr w:type="spellStart"/>
-      <w:r>
-        <w:t>reset_url</w:t>
-      </w:r>
-      <w:proofErr w:type="spellEnd"/>
-      <w:r>
-        <w:t>: "https://bracketworks.app/reset-password?token=TOKEN_HERE",</w:t>
-      </w:r>
-      <w:r>
-        <w:br/>
-      </w:r>
-    </w:p>
-    <w:p>
-      <w:pPr>
-        <w:pStyle w:val="ListParagraph"/>
-        <w:numPr>
-          <w:ilvl w:val="0"/>
-          <w:numId w:val="16"/>
-        </w:numPr>
-      </w:pPr>
-    </w:p>
-    <w:p>
-      <w:pPr>
-        <w:pStyle w:val="ListParagraph"/>
-        <w:numPr>
-          <w:ilvl w:val="0"/>
-          <w:numId w:val="16"/>
-        </w:numPr>
-      </w:pPr>
-      <w:r>
-        <w:t xml:space="preserve">Deploy </w:t>
-      </w:r>
-      <w:proofErr w:type="spellStart"/>
-      <w:r>
-        <w:t>webb</w:t>
-      </w:r>
-      <w:proofErr w:type="spellEnd"/>
-      <w:r>
-        <w:t xml:space="preserve"> app on </w:t>
-      </w:r>
-      <w:hyperlink r:id="rId9" w:history="1">
-        <w:r>
-          <w:rPr>
-            <w:rStyle w:val="Hyperlink"/>
-          </w:rPr>
-          <w:t>https://railway.com/</w:t>
-        </w:r>
-      </w:hyperlink>
     </w:p>
     <w:p>
       <w:pPr>
@@ -3067,6 +2856,7 @@
   <w:style w:type="character" w:default="1" w:styleId="DefaultParagraphFont">
     <w:name w:val="Default Paragraph Font"/>
     <w:uiPriority w:val="1"/>
+    <w:semiHidden/>
     <w:unhideWhenUsed/>
   </w:style>
   <w:style w:type="table" w:default="1" w:styleId="TableNormal">

</xml_diff>

<commit_message>
Update styling and functionality of app
</commit_message>
<xml_diff>
--- a/BrackWorks ToDo.docx
+++ b/BrackWorks ToDo.docx
@@ -4,24 +4,186 @@
   <w:body>
     <w:p>
       <w:pPr>
-        <w:pStyle w:val="ListParagraph"/>
-        <w:numPr>
-          <w:ilvl w:val="0"/>
-          <w:numId w:val="16"/>
-        </w:numPr>
+        <w:ind w:left="360"/>
       </w:pPr>
       <w:r>
-        <w:t xml:space="preserve">Add a pop up on the brackets page that if the entries changed the user should rerun brackets. This pop should also occur on the scores page if the user tries to create payouts if there is a mismatch between the entries and brackets. </w:t>
+        <w:t>Workflow updates needed:</w:t>
       </w:r>
     </w:p>
     <w:p>
       <w:pPr>
-        <w:pStyle w:val="ListParagraph"/>
-        <w:numPr>
-          <w:ilvl w:val="1"/>
-          <w:numId w:val="16"/>
-        </w:numPr>
-      </w:pPr>
+        <w:ind w:left="360"/>
+      </w:pPr>
+    </w:p>
+    <w:p>
+      <w:pPr>
+        <w:ind w:left="360"/>
+      </w:pPr>
+      <w:r>
+        <w:t>1. Bracket mismatch warning</w:t>
+      </w:r>
+    </w:p>
+    <w:p>
+      <w:pPr>
+        <w:ind w:left="360"/>
+      </w:pPr>
+      <w:r>
+        <w:t>- On the Brackets page, show a popup if entries have changed since brackets were generated.</w:t>
+      </w:r>
+    </w:p>
+    <w:p>
+      <w:pPr>
+        <w:ind w:left="360"/>
+      </w:pPr>
+      <w:r>
+        <w:t>- Message should explain that the current entries no longer match the generated brackets.</w:t>
+      </w:r>
+    </w:p>
+    <w:p>
+      <w:pPr>
+        <w:ind w:left="360"/>
+      </w:pPr>
+      <w:r>
+        <w:t>- User should be prompted to rerun brackets.</w:t>
+      </w:r>
+    </w:p>
+    <w:p>
+      <w:pPr>
+        <w:ind w:left="360"/>
+      </w:pPr>
+    </w:p>
+    <w:p>
+      <w:pPr>
+        <w:ind w:left="360"/>
+      </w:pPr>
+      <w:r>
+        <w:t>2. Payout creation protection</w:t>
+      </w:r>
+    </w:p>
+    <w:p>
+      <w:pPr>
+        <w:ind w:left="360"/>
+      </w:pPr>
+      <w:r>
+        <w:t>- On the Scores page, if the user attempts to create payouts while entries and brackets are mismatched, show a warning popup.</w:t>
+      </w:r>
+    </w:p>
+    <w:p>
+      <w:pPr>
+        <w:ind w:left="360"/>
+      </w:pPr>
+      <w:r>
+        <w:t>- Prevent payout creation until brackets are rerun.</w:t>
+      </w:r>
+    </w:p>
+    <w:p>
+      <w:pPr>
+        <w:ind w:left="360"/>
+      </w:pPr>
+    </w:p>
+    <w:p>
+      <w:pPr>
+        <w:ind w:left="360"/>
+      </w:pPr>
+      <w:r>
+        <w:t>3. Payout reset logic</w:t>
+      </w:r>
+    </w:p>
+    <w:p>
+      <w:pPr>
+        <w:ind w:left="360"/>
+      </w:pPr>
+      <w:r>
+        <w:t>- If entries or scores are updated after payouts have been calculated, reset payout statuses.</w:t>
+      </w:r>
+    </w:p>
+    <w:p>
+      <w:pPr>
+        <w:ind w:left="360"/>
+      </w:pPr>
+      <w:r>
+        <w:t>- All payouts should return to unpaid/review-needed status.</w:t>
+      </w:r>
+    </w:p>
+    <w:p>
+      <w:pPr>
+        <w:ind w:left="360"/>
+      </w:pPr>
+    </w:p>
+    <w:p>
+      <w:pPr>
+        <w:ind w:left="360"/>
+      </w:pPr>
+      <w:r>
+        <w:t>4. Payouts page redirect logic</w:t>
+      </w:r>
+    </w:p>
+    <w:p>
+      <w:pPr>
+        <w:ind w:left="360"/>
+      </w:pPr>
+      <w:r>
+        <w:t>- If scores are not locked, the Payouts page should explain that scores must be locked before payouts can be calculated.</w:t>
+      </w:r>
+    </w:p>
+    <w:p>
+      <w:pPr>
+        <w:ind w:left="360"/>
+      </w:pPr>
+      <w:r>
+        <w:t>- The user should be redirected or sent to the Scores page, not the Dashboard.</w:t>
+      </w:r>
+    </w:p>
+    <w:p>
+      <w:pPr>
+        <w:ind w:left="360"/>
+      </w:pPr>
+    </w:p>
+    <w:p>
+      <w:pPr>
+        <w:ind w:left="360"/>
+      </w:pPr>
+      <w:r>
+        <w:t>5. Unloading/loading states</w:t>
+      </w:r>
+    </w:p>
+    <w:p>
+      <w:pPr>
+        <w:ind w:left="360"/>
+      </w:pPr>
+      <w:r>
+        <w:t xml:space="preserve">- Update all unload/loading state pages to match the current </w:t>
+      </w:r>
+      <w:proofErr w:type="spellStart"/>
+      <w:r>
+        <w:t>BracketWorks</w:t>
+      </w:r>
+      <w:proofErr w:type="spellEnd"/>
+      <w:r>
+        <w:t xml:space="preserve"> design system and wording.</w:t>
+      </w:r>
+    </w:p>
+    <w:p>
+      <w:pPr>
+        <w:ind w:left="360"/>
+      </w:pPr>
+    </w:p>
+    <w:p>
+      <w:pPr>
+        <w:ind w:left="360"/>
+      </w:pPr>
+      <w:r>
+        <w:t>6. Dashboard Guide visibility</w:t>
+      </w:r>
+    </w:p>
+    <w:p>
+      <w:pPr>
+        <w:ind w:left="360"/>
+      </w:pPr>
+      <w:r>
+        <w:lastRenderedPageBreak/>
+        <w:t>- The Tournament Dashboard Guide button should remain visible and accessible at all times from the Tournament Dashboard.</w:t>
+      </w:r>
     </w:p>
     <w:p/>
     <w:p/>

</xml_diff>

<commit_message>
chore: apply workspace cleanup and styling updates
</commit_message>
<xml_diff>
--- a/BrackWorks ToDo.docx
+++ b/BrackWorks ToDo.docx
@@ -18,82 +18,142 @@
     <w:p>
       <w:pPr>
         <w:ind w:left="360"/>
+        <w:rPr>
+          <w:strike/>
+        </w:rPr>
       </w:pPr>
       <w:r>
+        <w:rPr>
+          <w:strike/>
+        </w:rPr>
         <w:t>1. Bracket mismatch warning</w:t>
       </w:r>
     </w:p>
     <w:p>
       <w:pPr>
         <w:ind w:left="360"/>
+        <w:rPr>
+          <w:strike/>
+        </w:rPr>
       </w:pPr>
       <w:r>
+        <w:rPr>
+          <w:strike/>
+        </w:rPr>
         <w:t>- On the Brackets page, show a popup if entries have changed since brackets were generated.</w:t>
       </w:r>
     </w:p>
     <w:p>
       <w:pPr>
         <w:ind w:left="360"/>
+        <w:rPr>
+          <w:strike/>
+        </w:rPr>
       </w:pPr>
       <w:r>
+        <w:rPr>
+          <w:strike/>
+        </w:rPr>
         <w:t>- Message should explain that the current entries no longer match the generated brackets.</w:t>
       </w:r>
     </w:p>
     <w:p>
       <w:pPr>
         <w:ind w:left="360"/>
+        <w:rPr>
+          <w:strike/>
+        </w:rPr>
       </w:pPr>
       <w:r>
+        <w:rPr>
+          <w:strike/>
+        </w:rPr>
         <w:t>- User should be prompted to rerun brackets.</w:t>
       </w:r>
     </w:p>
     <w:p>
       <w:pPr>
         <w:ind w:left="360"/>
+        <w:rPr>
+          <w:strike/>
+        </w:rPr>
       </w:pPr>
     </w:p>
     <w:p>
       <w:pPr>
         <w:ind w:left="360"/>
+        <w:rPr>
+          <w:strike/>
+        </w:rPr>
       </w:pPr>
       <w:r>
+        <w:rPr>
+          <w:strike/>
+        </w:rPr>
         <w:t>2. Payout creation protection</w:t>
       </w:r>
     </w:p>
     <w:p>
       <w:pPr>
         <w:ind w:left="360"/>
+        <w:rPr>
+          <w:strike/>
+        </w:rPr>
       </w:pPr>
       <w:r>
+        <w:rPr>
+          <w:strike/>
+        </w:rPr>
         <w:t>- On the Scores page, if the user attempts to create payouts while entries and brackets are mismatched, show a warning popup.</w:t>
       </w:r>
     </w:p>
     <w:p>
       <w:pPr>
         <w:ind w:left="360"/>
+        <w:rPr>
+          <w:strike/>
+        </w:rPr>
       </w:pPr>
       <w:r>
+        <w:rPr>
+          <w:strike/>
+        </w:rPr>
         <w:t>- Prevent payout creation until brackets are rerun.</w:t>
       </w:r>
     </w:p>
     <w:p>
       <w:pPr>
         <w:ind w:left="360"/>
+        <w:rPr>
+          <w:strike/>
+        </w:rPr>
       </w:pPr>
     </w:p>
     <w:p>
       <w:pPr>
         <w:ind w:left="360"/>
+        <w:rPr>
+          <w:strike/>
+        </w:rPr>
       </w:pPr>
       <w:r>
+        <w:rPr>
+          <w:strike/>
+        </w:rPr>
         <w:t>3. Payout reset logic</w:t>
       </w:r>
     </w:p>
     <w:p>
       <w:pPr>
         <w:ind w:left="360"/>
+        <w:rPr>
+          <w:strike/>
+        </w:rPr>
       </w:pPr>
       <w:r>
+        <w:rPr>
+          <w:strike/>
+        </w:rPr>
         <w:t>- If entries or scores are updated after payouts have been calculated, reset payout statuses.</w:t>
       </w:r>
     </w:p>
@@ -102,6 +162,9 @@
         <w:ind w:left="360"/>
       </w:pPr>
       <w:r>
+        <w:rPr>
+          <w:strike/>
+        </w:rPr>
         <w:t>- All payouts should return to unpaid/review-needed status.</w:t>
       </w:r>
     </w:p>
@@ -152,7 +215,15 @@
         <w:ind w:left="360"/>
       </w:pPr>
       <w:r>
-        <w:t xml:space="preserve">- Update all unload/loading state pages to match the current </w:t>
+        <w:t xml:space="preserve">- Update all </w:t>
+      </w:r>
+      <w:proofErr w:type="gramStart"/>
+      <w:r>
+        <w:t>unload</w:t>
+      </w:r>
+      <w:proofErr w:type="gramEnd"/>
+      <w:r>
+        <w:t xml:space="preserve">/loading state pages to match the current </w:t>
       </w:r>
       <w:proofErr w:type="spellStart"/>
       <w:r>
@@ -173,8 +244,13 @@
         <w:ind w:left="360"/>
       </w:pPr>
       <w:r>
-        <w:t>6. Dashboard Guide visibility</w:t>
+        <w:t xml:space="preserve">6. Dashboard Guide </w:t>
       </w:r>
+      <w:proofErr w:type="gramStart"/>
+      <w:r>
+        <w:t>visibility</w:t>
+      </w:r>
+      <w:proofErr w:type="gramEnd"/>
     </w:p>
     <w:p>
       <w:pPr>

</xml_diff>

<commit_message>
Security hardening, auth cookie-CSRF, admin refresh UX, and test coverage updates
</commit_message>
<xml_diff>
--- a/BrackWorks ToDo.docx
+++ b/BrackWorks ToDo.docx
@@ -176,24 +176,45 @@
     <w:p>
       <w:pPr>
         <w:ind w:left="360"/>
+        <w:rPr>
+          <w:strike/>
+        </w:rPr>
       </w:pPr>
       <w:r>
-        <w:t>4. Payouts page redirect logic</w:t>
+        <w:t xml:space="preserve">4. </w:t>
+      </w:r>
+      <w:r>
+        <w:rPr>
+          <w:strike/>
+        </w:rPr>
+        <w:t>Payouts page redirect logic</w:t>
       </w:r>
     </w:p>
     <w:p>
       <w:pPr>
         <w:ind w:left="360"/>
+        <w:rPr>
+          <w:strike/>
+        </w:rPr>
       </w:pPr>
       <w:r>
+        <w:rPr>
+          <w:strike/>
+        </w:rPr>
         <w:t>- If scores are not locked, the Payouts page should explain that scores must be locked before payouts can be calculated.</w:t>
       </w:r>
     </w:p>
     <w:p>
       <w:pPr>
         <w:ind w:left="360"/>
+        <w:rPr>
+          <w:strike/>
+        </w:rPr>
       </w:pPr>
       <w:r>
+        <w:rPr>
+          <w:strike/>
+        </w:rPr>
         <w:t>- The user should be redirected or sent to the Scores page, not the Dashboard.</w:t>
       </w:r>
     </w:p>
@@ -215,7 +236,15 @@
         <w:ind w:left="360"/>
       </w:pPr>
       <w:r>
-        <w:t xml:space="preserve">- Update all unload/loading state pages to match the current </w:t>
+        <w:t xml:space="preserve">- Update all </w:t>
+      </w:r>
+      <w:proofErr w:type="gramStart"/>
+      <w:r>
+        <w:t>unload</w:t>
+      </w:r>
+      <w:proofErr w:type="gramEnd"/>
+      <w:r>
+        <w:t xml:space="preserve">/loading state pages to match the current </w:t>
       </w:r>
       <w:proofErr w:type="spellStart"/>
       <w:r>
@@ -234,21 +263,64 @@
     <w:p>
       <w:pPr>
         <w:ind w:left="360"/>
+        <w:rPr>
+          <w:strike/>
+        </w:rPr>
       </w:pPr>
       <w:r>
-        <w:t>6. Dashboard Guide visibility</w:t>
+        <w:t xml:space="preserve">6. </w:t>
+      </w:r>
+      <w:r>
+        <w:rPr>
+          <w:strike/>
+        </w:rPr>
+        <w:t xml:space="preserve">Dashboard Guide </w:t>
+      </w:r>
+      <w:proofErr w:type="gramStart"/>
+      <w:r>
+        <w:rPr>
+          <w:strike/>
+        </w:rPr>
+        <w:t>visibility</w:t>
+      </w:r>
+      <w:proofErr w:type="gramEnd"/>
+    </w:p>
+    <w:p>
+      <w:pPr>
+        <w:ind w:left="360"/>
+        <w:rPr>
+          <w:strike/>
+        </w:rPr>
+      </w:pPr>
+      <w:r>
+        <w:rPr>
+          <w:strike/>
+        </w:rPr>
+        <w:lastRenderedPageBreak/>
+        <w:t xml:space="preserve">- The Tournament Dashboard Guide button should </w:t>
+      </w:r>
+      <w:proofErr w:type="gramStart"/>
+      <w:r>
+        <w:rPr>
+          <w:strike/>
+        </w:rPr>
+        <w:t>remain visible and accessible at all times</w:t>
+      </w:r>
+      <w:proofErr w:type="gramEnd"/>
+      <w:r>
+        <w:rPr>
+          <w:strike/>
+        </w:rPr>
+        <w:t xml:space="preserve"> from the Tournament Dashboard.</w:t>
       </w:r>
     </w:p>
     <w:p>
       <w:pPr>
-        <w:ind w:left="360"/>
-      </w:pPr>
-      <w:r>
-        <w:lastRenderedPageBreak/>
-        <w:t>- The Tournament Dashboard Guide button should remain visible and accessible at all times from the Tournament Dashboard.</w:t>
-      </w:r>
+        <w:rPr>
+          <w:strike/>
+        </w:rPr>
+      </w:pPr>
     </w:p>
-    <w:p/>
     <w:p>
       <w:pPr>
         <w:pStyle w:val="ListParagraph"/>
@@ -256,8 +328,14 @@
           <w:ilvl w:val="0"/>
           <w:numId w:val="17"/>
         </w:numPr>
+        <w:rPr>
+          <w:strike/>
+        </w:rPr>
       </w:pPr>
       <w:r>
+        <w:rPr>
+          <w:strike/>
+        </w:rPr>
         <w:t>Normalize text sizes on the landing page</w:t>
       </w:r>
     </w:p>
@@ -282,6 +360,9 @@
         </w:numPr>
       </w:pPr>
       <w:r>
+        <w:rPr>
+          <w:noProof/>
+        </w:rPr>
         <w:drawing>
           <wp:inline distT="0" distB="0" distL="0" distR="0" wp14:anchorId="6CEE5F1A" wp14:editId="2FA6255A">
             <wp:extent cx="5943600" cy="440690"/>
@@ -326,8 +407,14 @@
           <w:ilvl w:val="0"/>
           <w:numId w:val="17"/>
         </w:numPr>
+        <w:rPr>
+          <w:strike/>
+        </w:rPr>
       </w:pPr>
       <w:r>
+        <w:rPr>
+          <w:strike/>
+        </w:rPr>
         <w:t xml:space="preserve">Make smaller </w:t>
       </w:r>
     </w:p>
@@ -340,6 +427,9 @@
         </w:numPr>
       </w:pPr>
       <w:r>
+        <w:rPr>
+          <w:noProof/>
+        </w:rPr>
         <w:drawing>
           <wp:inline distT="0" distB="0" distL="0" distR="0" wp14:anchorId="151A1AA6" wp14:editId="257D0555">
             <wp:extent cx="4439270" cy="6192114"/>

</xml_diff>